<commit_message>
idk added bunch of metrics and debug some stuff in HR dashboard
</commit_message>
<xml_diff>
--- a/documents/templates/attestation_salaire.docx
+++ b/documents/templates/attestation_salaire.docx
@@ -20,7 +20,29 @@
         <w:rPr>
           <w:rtl w:val="0"/>
         </w:rPr>
-        <w:t xml:space="preserve">TechServ Solutions</w:t>
+        <w:t xml:space="preserve">TECHSERV SOLUTIONS </w:t>
+      </w:r>
+    </w:p>
+    <w:p>
+      <w:pPr>
+        <w:rPr/>
+      </w:pPr>
+      <w:r>
+        <w:rPr>
+          <w:rtl w:val="0"/>
+        </w:rPr>
+        <w:t xml:space="preserve">Tél : +212 5 XX XX XX XX</w:t>
+      </w:r>
+    </w:p>
+    <w:p>
+      <w:pPr>
+        <w:rPr/>
+      </w:pPr>
+      <w:r>
+        <w:rPr>
+          <w:rtl w:val="0"/>
+        </w:rPr>
+        <w:t xml:space="preserve">Email : contact@techserv.ma </w:t>
       </w:r>
     </w:p>
     <w:p>
@@ -381,7 +403,7 @@
       <w:rPr/>
       <w:drawing>
         <wp:inline distB="114300" distT="114300" distL="114300" distR="114300">
-          <wp:extent cx="2033588" cy="594900"/>
+          <wp:extent cx="1166813" cy="933450"/>
           <wp:effectExtent b="0" l="0" r="0" t="0"/>
           <wp:docPr id="1" name="image1.png"/>
           <a:graphic>
@@ -401,7 +423,7 @@
                 <pic:spPr>
                   <a:xfrm>
                     <a:off x="0" y="0"/>
-                    <a:ext cx="2033588" cy="594900"/>
+                    <a:ext cx="1166813" cy="933450"/>
                   </a:xfrm>
                   <a:prstGeom prst="rect"/>
                   <a:ln/>

</xml_diff>